<commit_message>
fix(c07 film): PURGE C06 din C07 - deschidere + fenomene + obiective etape
Raport ARHITECT: FILM C07 avea propagare incompleta (~40-50%) - sectiunile
DESCHIDERE, SCENA REALA (cele 5 fenomene) si OBIECTIVELE etapelor 2/4 erau inca
in limbaj C06 numeric (suma/medie/mediana/amplitudine/dispersie/concentrare,
agregate numerice, AGGREGATE).

PURGE: 14 paragrafe rescrise pe axa temporala. Fenomene noi: PERIOADA REALA /
ACOPERIREA TEMPORALA / RITMUL LUNAR / LUNA DOMINANTA / MEMORIA SETULUI.
Deschiderea: C06 a aflat cat de mare e setul; C07 citeste memoria temporala.
Etapa 2: profil temporal; Etapa 4: verificarea cronologiei.
Pastrat legitim: conservarea sumei (R-V02.14) + recunoasterea predecesorului C06.

Machetele HTML erau deja curate (audit 70/70). Fix strict in docx FILM.

https://claude.ai/code/session_011hdPJf3hrU8AgLAMEvh9c2
</commit_message>
<xml_diff>
--- a/c07/FILM-Excel-07-Datare.docx
+++ b/c07/FILM-Excel-07-Datare.docx
@@ -495,7 +495,7 @@
           <w:rFonts w:ascii="Calibri" w:hAnsi="Calibri"/>
           <w:sz w:val="20"/>
         </w:rPr>
-        <w:t>Constructia 07 MEMORIA SETULUI preia setul profilat de constructia precedenta. C07 a profilat numeric setul. C07 face profilul CANTITATIV: perioada reala si ritmul lunar, volumul tipic pe luna, intervalul prima-ultima luna, trendul luna-la-luna si sezonalitatea si saptamana tipica.</w:t>
+        <w:t>Constructia 07 MEMORIA SETULUI preia setul profilat numeric de constructia precedenta. C06 a aflat cat de mare e setul. C07 citeste memoria temporala: perioada reala, golurile in timp, ritmul lunar, lunile dominante, accelerarile, sezonalitatea si saptamana tipica.</w:t>
       </w:r>
     </w:p>
     <w:p>
@@ -507,7 +507,7 @@
           <w:rFonts w:ascii="Calibri" w:hAnsi="Calibri"/>
           <w:sz w:val="20"/>
         </w:rPr>
-        <w:t>Profil numeric complet: suma, medie, mediana, amplitudine, dispersie, concentrare. Setul are dimensiune, centru si margini.</w:t>
+        <w:t>Pentru prima data, setul are un inceput, un ritm si o directie. Memoria temporala este completa.</w:t>
       </w:r>
     </w:p>
     <w:p>
@@ -619,7 +619,7 @@
           <w:color w:val="333333"/>
           <w:sz w:val="22"/>
         </w:rPr>
-        <w:t>01 · SUMA TOTALA</w:t>
+        <w:t>01 · PERIOADA REALĂ</w:t>
       </w:r>
     </w:p>
     <w:p>
@@ -631,7 +631,7 @@
           <w:rFonts w:ascii="Calibri" w:hAnsi="Calibri"/>
           <w:sz w:val="20"/>
         </w:rPr>
-        <w:t>suma pe categorie cu SUM si SUMIFS</w:t>
+        <w:t>prima si ultima data din set, cu MIN si MAX</w:t>
       </w:r>
     </w:p>
     <w:p>
@@ -644,7 +644,7 @@
           <w:color w:val="333333"/>
           <w:sz w:val="22"/>
         </w:rPr>
-        <w:t>02 · MEDIE SI MEDIANA</w:t>
+        <w:t>02 · ACOPERIREA TEMPORALĂ</w:t>
       </w:r>
     </w:p>
     <w:p>
@@ -656,7 +656,7 @@
           <w:rFonts w:ascii="Calibri" w:hAnsi="Calibri"/>
           <w:sz w:val="20"/>
         </w:rPr>
-        <w:t>volumul tipic pe luna cu AVERAGE si MEDIAN</w:t>
+        <w:t>luni lipsa, goluri in secventa cronologica</w:t>
       </w:r>
     </w:p>
     <w:p>
@@ -669,7 +669,7 @@
           <w:color w:val="333333"/>
           <w:sz w:val="22"/>
         </w:rPr>
-        <w:t>03 · AMPLITUDINE</w:t>
+        <w:t>03 · RITMUL LUNAR</w:t>
       </w:r>
     </w:p>
     <w:p>
@@ -681,7 +681,7 @@
           <w:rFonts w:ascii="Calibri" w:hAnsi="Calibri"/>
           <w:sz w:val="20"/>
         </w:rPr>
-        <w:t>minim si maxim cu MIN si MAX</w:t>
+        <w:t>volum pe luna, ritmul de baza al setului</w:t>
       </w:r>
     </w:p>
     <w:p>
@@ -694,7 +694,7 @@
           <w:color w:val="333333"/>
           <w:sz w:val="22"/>
         </w:rPr>
-        <w:t>04 · DISPERSIE</w:t>
+        <w:t>04 · LUNA DOMINANTĂ</w:t>
       </w:r>
     </w:p>
     <w:p>
@@ -706,7 +706,7 @@
           <w:rFonts w:ascii="Calibri" w:hAnsi="Calibri"/>
           <w:sz w:val="20"/>
         </w:rPr>
-        <w:t>abaterea standard a setului cu STDEV</w:t>
+        <w:t>luna-varf si luna-minim, plus trendul de la luna la luna</w:t>
       </w:r>
     </w:p>
     <w:p>
@@ -719,7 +719,7 @@
           <w:color w:val="333333"/>
           <w:sz w:val="22"/>
         </w:rPr>
-        <w:t>05 · CONCENTRARE</w:t>
+        <w:t>05 · MEMORIA SETULUI</w:t>
       </w:r>
     </w:p>
     <w:p>
@@ -731,7 +731,7 @@
           <w:rFonts w:ascii="Calibri" w:hAnsi="Calibri"/>
           <w:sz w:val="20"/>
         </w:rPr>
-        <w:t>Pareto numeric: ce procent aduce fiecare categorie</w:t>
+        <w:t>sezonalitatea si saptamana tipica: ce ritmuri se repeta</w:t>
       </w:r>
     </w:p>
     <w:p>
@@ -1005,7 +1005,7 @@
           <w:rFonts w:ascii="Calibri" w:hAnsi="Calibri"/>
           <w:sz w:val="20"/>
         </w:rPr>
-        <w:t>Promptul 1 raporteaza agregatele numerice ale setului. 5 fenomene temporale demonstrate. Suma conservata DELTA 0.</w:t>
+        <w:t>Promptul 1 construieste profilul temporal al setului. 5 fenomene temporale demonstrate. Suma conservata DELTA 0.</w:t>
       </w:r>
     </w:p>
     <w:p>
@@ -1431,7 +1431,7 @@
           <w:rFonts w:ascii="Calibri" w:hAnsi="Calibri"/>
           <w:sz w:val="20"/>
         </w:rPr>
-        <w:t>AGGREGATE / formule de verificare confirma martorul dupa transformare.</w:t>
+        <w:t>Verificarea cronologiei confirma perioada, ritmul si acoperirea temporala dupa profilare.</w:t>
       </w:r>
     </w:p>
     <w:p>

</xml_diff>

<commit_message>
fix(c07): rafinari ARHITECT - voce impersonala + slide5 + fenomen TREND separat
- "Operatorul" eliminat din naratiunea FILM (26 paragrafe -> "Noi"/impersonal:
  "Deschidem", "Confirmam martorul", "noi confirmam"). Voce cinematica, nu ISO.
- MIZA: "Obtinem memoria temporala..." (fara "operatorul").
- Slide 5 exec-phrase: "Astazi e memorie. Maine reflex" -> "O memorie utila e o
  memorie care se reconstruieste la refresh" (FILM + video + editor-video).
- Fenomene FILM: TREND separat ca fenomen propriu (04 · TRENDUL); 03 RITMUL preia
  luna-varf/minim; 05 · SEZON & SAPTAMANA. Aliniat cu SPEC C07.

audit_sync 70/70 ZERO DRIFT (anti-clona OK dupa slide5). HTML deja curat.

https://claude.ai/code/session_011hdPJf3hrU8AgLAMEvh9c2
</commit_message>
<xml_diff>
--- a/c07/FILM-Excel-07-Datare.docx
+++ b/c07/FILM-Excel-07-Datare.docx
@@ -92,7 +92,7 @@
           <w:rFonts w:ascii="Calibri" w:hAnsi="Calibri"/>
           <w:sz w:val="20"/>
         </w:rPr>
-        <w:t>Operatorul iese cu memoria temporală a setului (perioadă, ritm, trend, sezon). Nu mai presupune când s-a întâmplat.</w:t>
+        <w:t>Obținem memoria temporală a setului (perioadă, ritm, trend, sezon). Nu mai presupunem când s-a întâmplat.</w:t>
       </w:r>
     </w:p>
     <w:p>
@@ -423,7 +423,7 @@
           <w:b w:val="0"/>
           <w:sz w:val="20"/>
         </w:rPr>
-        <w:t>Astăzi e memorie. Mâine trebuie să fie reflex.</w:t>
+        <w:t>O memorie utilă e o memorie care se reconstruiește la refresh.</w:t>
       </w:r>
     </w:p>
     <w:p>
@@ -544,7 +544,7 @@
           <w:rFonts w:ascii="Calibri" w:hAnsi="Calibri"/>
           <w:sz w:val="20"/>
         </w:rPr>
-        <w:t>Audit + executie controlata. Raporteaza ce vede, aplica transformari cerute explicit de operator.</w:t>
+        <w:t>Audit + executie controlata. Raporteaza ce vede, aplica transformari cerute explicit de noi.</w:t>
       </w:r>
     </w:p>
     <w:p>
@@ -681,7 +681,7 @@
           <w:rFonts w:ascii="Calibri" w:hAnsi="Calibri"/>
           <w:sz w:val="20"/>
         </w:rPr>
-        <w:t>volum pe luna, ritmul de baza al setului</w:t>
+        <w:t>volum pe luna; luna-varf si luna-minim</w:t>
       </w:r>
     </w:p>
     <w:p>
@@ -694,7 +694,7 @@
           <w:color w:val="333333"/>
           <w:sz w:val="22"/>
         </w:rPr>
-        <w:t>04 · LUNA DOMINANTĂ</w:t>
+        <w:t>04 · TRENDUL</w:t>
       </w:r>
     </w:p>
     <w:p>
@@ -706,7 +706,7 @@
           <w:rFonts w:ascii="Calibri" w:hAnsi="Calibri"/>
           <w:sz w:val="20"/>
         </w:rPr>
-        <w:t>luna-varf si luna-minim, plus trendul de la luna la luna</w:t>
+        <w:t>directia volumului de la luna la luna: accelereaza sau incetineste</w:t>
       </w:r>
     </w:p>
     <w:p>
@@ -719,7 +719,7 @@
           <w:color w:val="333333"/>
           <w:sz w:val="22"/>
         </w:rPr>
-        <w:t>05 · MEMORIA SETULUI</w:t>
+        <w:t>05 · SEZON &amp; SĂPTĂMÂNĂ</w:t>
       </w:r>
     </w:p>
     <w:p>
@@ -792,7 +792,7 @@
           <w:rFonts w:ascii="Calibri" w:hAnsi="Calibri"/>
           <w:sz w:val="20"/>
         </w:rPr>
-        <w:t>Operatorul deschide fisierul predat de C5, recunoaste aparenta, fixeaza martorul.</w:t>
+        <w:t>Deschidem fisierul predat de C6, recunoastem aparenta, fixam martorul.</w:t>
       </w:r>
     </w:p>
     <w:p>
@@ -817,7 +817,7 @@
           <w:rFonts w:ascii="Calibri" w:hAnsi="Calibri"/>
           <w:sz w:val="20"/>
         </w:rPr>
-        <w:t>Recunoastere si control. Operatorul nu inventeaza, urmareste fenomenul.</w:t>
+        <w:t>Recunoastere si control. Nu inventam, urmarim fenomenul.</w:t>
       </w:r>
     </w:p>
     <w:p>
@@ -893,7 +893,7 @@
           <w:rFonts w:ascii="Calibri" w:hAnsi="Calibri"/>
           <w:sz w:val="20"/>
         </w:rPr>
-        <w:t>AI propune, operatorul confirma. Niciun pas neexplicit.</w:t>
+        <w:t>AI propune, noi confirmam. Niciun pas neexplicit.</w:t>
       </w:r>
     </w:p>
     <w:p>
@@ -918,7 +918,7 @@
           <w:rFonts w:ascii="Calibri" w:hAnsi="Calibri"/>
           <w:sz w:val="20"/>
         </w:rPr>
-        <w:t>Operatorul rosteste martorul: 'Etapa 1 confirmata. Predam mai departe.'</w:t>
+        <w:t>Confirmam martorul: 'Etapa 1 confirmata. Predam mai departe.'</w:t>
       </w:r>
     </w:p>
     <w:p>
@@ -1030,7 +1030,7 @@
           <w:rFonts w:ascii="Calibri" w:hAnsi="Calibri"/>
           <w:sz w:val="20"/>
         </w:rPr>
-        <w:t>Recunoastere si control. Operatorul nu inventeaza, urmareste fenomenul.</w:t>
+        <w:t>Recunoastere si control. Nu inventam, urmarim fenomenul.</w:t>
       </w:r>
     </w:p>
     <w:p>
@@ -1106,7 +1106,7 @@
           <w:rFonts w:ascii="Calibri" w:hAnsi="Calibri"/>
           <w:sz w:val="20"/>
         </w:rPr>
-        <w:t>AI propune, operatorul confirma. Niciun pas neexplicit.</w:t>
+        <w:t>AI propune, noi confirmam. Niciun pas neexplicit.</w:t>
       </w:r>
     </w:p>
     <w:p>
@@ -1131,7 +1131,7 @@
           <w:rFonts w:ascii="Calibri" w:hAnsi="Calibri"/>
           <w:sz w:val="20"/>
         </w:rPr>
-        <w:t>Operatorul rosteste martorul: 'Etapa 2 confirmata. Predam mai departe.'</w:t>
+        <w:t>Confirmam martorul: 'Etapa 2 confirmata. Predam mai departe.'</w:t>
       </w:r>
     </w:p>
     <w:p>
@@ -1243,7 +1243,7 @@
           <w:rFonts w:ascii="Calibri" w:hAnsi="Calibri"/>
           <w:sz w:val="20"/>
         </w:rPr>
-        <w:t>Recunoastere si control. Operatorul nu inventeaza, urmareste fenomenul.</w:t>
+        <w:t>Recunoastere si control. Nu inventam, urmarim fenomenul.</w:t>
       </w:r>
     </w:p>
     <w:p>
@@ -1319,7 +1319,7 @@
           <w:rFonts w:ascii="Calibri" w:hAnsi="Calibri"/>
           <w:sz w:val="20"/>
         </w:rPr>
-        <w:t>AI propune, operatorul confirma. Niciun pas neexplicit.</w:t>
+        <w:t>AI propune, noi confirmam. Niciun pas neexplicit.</w:t>
       </w:r>
     </w:p>
     <w:p>
@@ -1344,7 +1344,7 @@
           <w:rFonts w:ascii="Calibri" w:hAnsi="Calibri"/>
           <w:sz w:val="20"/>
         </w:rPr>
-        <w:t>Operatorul rosteste martorul: 'Etapa 3 confirmata. Predam mai departe.'</w:t>
+        <w:t>Confirmam martorul: 'Etapa 3 confirmata. Predam mai departe.'</w:t>
       </w:r>
     </w:p>
     <w:p>
@@ -1456,7 +1456,7 @@
           <w:rFonts w:ascii="Calibri" w:hAnsi="Calibri"/>
           <w:sz w:val="20"/>
         </w:rPr>
-        <w:t>Recunoastere si control. Operatorul nu inventeaza, urmareste fenomenul.</w:t>
+        <w:t>Recunoastere si control. Nu inventam, urmarim fenomenul.</w:t>
       </w:r>
     </w:p>
     <w:p>
@@ -1532,7 +1532,7 @@
           <w:rFonts w:ascii="Calibri" w:hAnsi="Calibri"/>
           <w:sz w:val="20"/>
         </w:rPr>
-        <w:t>AI propune, operatorul confirma. Niciun pas neexplicit.</w:t>
+        <w:t>AI propune, noi confirmam. Niciun pas neexplicit.</w:t>
       </w:r>
     </w:p>
     <w:p>
@@ -1557,7 +1557,7 @@
           <w:rFonts w:ascii="Calibri" w:hAnsi="Calibri"/>
           <w:sz w:val="20"/>
         </w:rPr>
-        <w:t>Operatorul rosteste martorul: 'Etapa 4 confirmata. Predam mai departe.'</w:t>
+        <w:t>Confirmam martorul: 'Etapa 4 confirmata. Predam mai departe.'</w:t>
       </w:r>
     </w:p>
     <w:p>
@@ -1669,7 +1669,7 @@
           <w:rFonts w:ascii="Calibri" w:hAnsi="Calibri"/>
           <w:sz w:val="20"/>
         </w:rPr>
-        <w:t>Recunoastere si control. Operatorul nu inventeaza, urmareste fenomenul.</w:t>
+        <w:t>Recunoastere si control. Nu inventam, urmarim fenomenul.</w:t>
       </w:r>
     </w:p>
     <w:p>
@@ -1745,7 +1745,7 @@
           <w:rFonts w:ascii="Calibri" w:hAnsi="Calibri"/>
           <w:sz w:val="20"/>
         </w:rPr>
-        <w:t>AI propune, operatorul confirma. Niciun pas neexplicit.</w:t>
+        <w:t>AI propune, noi confirmam. Niciun pas neexplicit.</w:t>
       </w:r>
     </w:p>
     <w:p>
@@ -1770,7 +1770,7 @@
           <w:rFonts w:ascii="Calibri" w:hAnsi="Calibri"/>
           <w:sz w:val="20"/>
         </w:rPr>
-        <w:t>Operatorul rosteste martorul: 'Etapa 5 confirmata. Predam mai departe.'</w:t>
+        <w:t>Confirmam martorul: 'Etapa 5 confirmata. Predam mai departe.'</w:t>
       </w:r>
     </w:p>
     <w:p>
@@ -1882,7 +1882,7 @@
           <w:rFonts w:ascii="Calibri" w:hAnsi="Calibri"/>
           <w:sz w:val="20"/>
         </w:rPr>
-        <w:t>Recunoastere si control. Operatorul nu inventeaza, urmareste fenomenul.</w:t>
+        <w:t>Recunoastere si control. Nu inventam, urmarim fenomenul.</w:t>
       </w:r>
     </w:p>
     <w:p>
@@ -1958,7 +1958,7 @@
           <w:rFonts w:ascii="Calibri" w:hAnsi="Calibri"/>
           <w:sz w:val="20"/>
         </w:rPr>
-        <w:t>AI propune, operatorul confirma. Niciun pas neexplicit.</w:t>
+        <w:t>AI propune, noi confirmam. Niciun pas neexplicit.</w:t>
       </w:r>
     </w:p>
     <w:p>
@@ -1983,7 +1983,7 @@
           <w:rFonts w:ascii="Calibri" w:hAnsi="Calibri"/>
           <w:sz w:val="20"/>
         </w:rPr>
-        <w:t>Operatorul rosteste martorul: 'Etapa 6 confirmata. Predam mai departe.'</w:t>
+        <w:t>Confirmam martorul: 'Etapa 6 confirmata. Predam mai departe.'</w:t>
       </w:r>
     </w:p>
     <w:p>

</xml_diff>

<commit_message>
fix(c07): sincronizez FILM cu HTML (motto + fenomene 02/03 + curat domina)
Verificare sync HTML<->FILM dupa schimbarea mantrei. Gasit si reparat in FILM:
1. MOTTO desincronizat: FILM avea inca 'O memorie citita. Apoi orice decizie.'
   -> 'Un set datat. Apoi orice analiza in timp.' (ca HTML).
2. Fenomene 02/03 inversate fata de HTML: FILM 02=ACOPERIRE/03=GRANULARITATE
   -> aliniat la HTML: 02 GRANULARITATE TEMPORALA, 03 GOLURI IN TIMP (label+desc).
3. CONTAMINARE T3 ratata: fenomen 04 CALENDAR zicea 'ce zi a saptamanii DOMINA'
   (dominanta=T3) -> 'sezon calendaristic, perioada comerciala, zi lucratoare
   vs weekend' (ca HTML). Supravietuise purgei anterioare doar in FILM.

Mantra/WOW/payoff/etape erau deja sync. Zero termeni interzisi in FILM.
Audit ZERO DRIFT 104/104.
</commit_message>
<xml_diff>
--- a/c07/FILM-Excel-07-Datare.docx
+++ b/c07/FILM-Excel-07-Datare.docx
@@ -164,7 +164,7 @@
           <w:rFonts w:ascii="Calibri" w:hAnsi="Calibri"/>
           <w:sz w:val="20"/>
         </w:rPr>
-        <w:t>O memorie citită. Apoi orice decizie.</w:t>
+        <w:t>Un set datat. Apoi orice analiza in timp.</w:t>
       </w:r>
     </w:p>
     <w:p>
@@ -644,7 +644,32 @@
           <w:color w:val="333333"/>
           <w:sz w:val="22"/>
         </w:rPr>
-        <w:t>02 · ACOPERIREA TEMPORALĂ</w:t>
+        <w:t>02 · GRANULARITATE TEMPORALAĂ</w:t>
+      </w:r>
+    </w:p>
+    <w:p>
+      <w:pPr>
+        <w:spacing w:after="80"/>
+      </w:pPr>
+      <w:r>
+        <w:rPr>
+          <w:rFonts w:ascii="Calibri" w:hAnsi="Calibri"/>
+          <w:sz w:val="20"/>
+        </w:rPr>
+        <w:t>zi, luna, trimestru, an, zi a saptamanii derivate</w:t>
+      </w:r>
+    </w:p>
+    <w:p>
+      <w:pPr>
+        <w:spacing w:before="160" w:after="40"/>
+      </w:pPr>
+      <w:r>
+        <w:rPr>
+          <w:b/>
+          <w:color w:val="333333"/>
+          <w:sz w:val="22"/>
+        </w:rPr>
+        <w:t>03 · GOLURI IN TIMP</w:t>
       </w:r>
     </w:p>
     <w:p>
@@ -657,31 +682,6 @@
           <w:sz w:val="20"/>
         </w:rPr>
         <w:t>luni lipsa, goluri in secventa cronologica</w:t>
-      </w:r>
-    </w:p>
-    <w:p>
-      <w:pPr>
-        <w:spacing w:before="160" w:after="40"/>
-      </w:pPr>
-      <w:r>
-        <w:rPr>
-          <w:b/>
-          <w:color w:val="333333"/>
-          <w:sz w:val="22"/>
-        </w:rPr>
-        <w:t>03 · GRANULARITATE TEMPORALA</w:t>
-      </w:r>
-    </w:p>
-    <w:p>
-      <w:pPr>
-        <w:spacing w:after="80"/>
-      </w:pPr>
-      <w:r>
-        <w:rPr>
-          <w:rFonts w:ascii="Calibri" w:hAnsi="Calibri"/>
-          <w:sz w:val="20"/>
-        </w:rPr>
-        <w:t>zi, luna, trimestru, an, zi a saptamanii derivate</w:t>
       </w:r>
     </w:p>
     <w:p>
@@ -706,7 +706,7 @@
           <w:rFonts w:ascii="Calibri" w:hAnsi="Calibri"/>
           <w:sz w:val="20"/>
         </w:rPr>
-        <w:t>ce zi a saptamanii domina si cum se distribuie pe zile lucratoare vs weekend</w:t>
+        <w:t>sezon calendaristic, perioada comerciala, zi lucratoare vs weekend, derivate din data</w:t>
       </w:r>
     </w:p>
     <w:p>

</xml_diff>